<commit_message>
Fix Character Lab entries to match the real form (verified vs studio source)
Corrections from Ruthy's screenshots + js/app.js verification:
- Undertone and Hair texture are single-select dropdowns, not combinable
  free text (fixed Maria's undertone to 'olive' alone, hair texture to a
  literal dropdown option)
- Hair style 'custom (type below)' is a studio bug - no text field ever
  appears; documented workaround (put real style in Face details instead)
- Added the missing Build field for both characters
- Removed the 'consolidated description' block - no such field exists in
  the actual Lab form
- Rebuilt RAMP_CharacterSheet_MariaJames.docx to match the verified
  field-by-field structure exactly

Co-Authored-By: Claude Fable 5 <noreply@anthropic.com>
Claude-Session: https://claude.ai/code/session_01BbznzE6vYuuAPK9F9HY6r3
</commit_message>
<xml_diff>
--- a/restaurant-track/characters/RAMP_CharacterSheet_MariaJames.docx
+++ b/restaurant-track/characters/RAMP_CharacterSheet_MariaJames.docx
@@ -12,7 +12,23 @@
     </w:p>
     <w:p>
       <w:r>
-        <w:t>Paste-ready field values for the RAMP studio Character Lab. Copy each field into its matching Lab input, or use the single consolidated paragraph at the end of each character's section if the Lab takes one free-text description instead.</w:t>
+        <w:t>Field values for the RAMP studio's actual Character Lab form (verified against the studio's source code, not guessed). Enter one value per field, in the order shown.</w:t>
+      </w:r>
+    </w:p>
+    <w:p>
+      <w:pPr>
+        <w:pStyle w:val="Heading3"/>
+      </w:pPr>
+      <w:r>
+        <w:t>Before you start — two things about the real form</w:t>
+      </w:r>
+    </w:p>
+    <w:p>
+      <w:r>
+        <w:rPr>
+          <w:color w:val="B03A2E"/>
+        </w:rPr>
+        <w:t>1) Undertone and Hair texture are single-select dropdowns — pick exactly ONE value from each, not a combination. 2) The Hair Style dropdown's "custom (type below)" option is a studio bug: no text box actually appears. None of its presets (all natural/textured Black hairstyling terms — afro, braids, locs, twists, bantu knots, silk press) fit a low bun or a short professional cut anyway. Workaround used below: pick any preset for that dropdown (it won't matter) and the REAL hairstyle instruction is written into the Face details field instead, which is free text.</w:t>
       </w:r>
     </w:p>
     <w:p>
@@ -50,7 +66,18 @@
         <w:rPr>
           <w:b/>
         </w:rPr>
-        <w:t xml:space="preserve">Race / ethnicity: </w:t>
+        <w:t xml:space="preserve">Gender / identity: </w:t>
+      </w:r>
+      <w:r>
+        <w:t>woman</w:t>
+      </w:r>
+    </w:p>
+    <w:p>
+      <w:r>
+        <w:rPr>
+          <w:b/>
+        </w:rPr>
+        <w:t xml:space="preserve">Ethnicity / ancestry: </w:t>
       </w:r>
       <w:r>
         <w:t>Latina — Mexican heritage</w:t>
@@ -61,10 +88,10 @@
         <w:rPr>
           <w:b/>
         </w:rPr>
-        <w:t xml:space="preserve">Skin tone (Monk scale 1-10): </w:t>
+        <w:t xml:space="preserve">Skin tone: </w:t>
       </w:r>
       <w:r>
-        <w:t>5 — medium olive (typical Latina tone)</w:t>
+        <w:t>Click swatch 5 on the Monk Skin Tone row</w:t>
       </w:r>
     </w:p>
     <w:p>
@@ -72,10 +99,20 @@
         <w:rPr>
           <w:b/>
         </w:rPr>
-        <w:t xml:space="preserve">Undertone: </w:t>
+        <w:t xml:space="preserve">Undertone (dropdown): </w:t>
       </w:r>
       <w:r>
-        <w:t>Olive / warm-neutral</w:t>
+        <w:t>olive</w:t>
+      </w:r>
+    </w:p>
+    <w:p>
+      <w:r>
+        <w:rPr>
+          <w:i/>
+          <w:color w:val="666666"/>
+          <w:sz w:val="18"/>
+        </w:rPr>
+        <w:t>Pick this one value only — do not also type "warm-neutral."</w:t>
       </w:r>
     </w:p>
     <w:p>
@@ -83,10 +120,20 @@
         <w:rPr>
           <w:b/>
         </w:rPr>
-        <w:t xml:space="preserve">Hair texture: </w:t>
+        <w:t xml:space="preserve">Hair texture (dropdown): </w:t>
       </w:r>
       <w:r>
-        <w:t>2C-3A (defined waves / loose curls), dark brown</w:t>
+        <w:t>Loose curls (3A)</w:t>
+      </w:r>
+    </w:p>
+    <w:p>
+      <w:r>
+        <w:rPr>
+          <w:i/>
+          <w:color w:val="666666"/>
+          <w:sz w:val="18"/>
+        </w:rPr>
+        <w:t>Closest literal match to "defined waves / loose curls." If a render looks too tightly curled, switch this one dropdown value to "Wavy (2A–2C)" and regenerate.</w:t>
       </w:r>
     </w:p>
     <w:p>
@@ -94,10 +141,31 @@
         <w:rPr>
           <w:b/>
         </w:rPr>
-        <w:t xml:space="preserve">Hair style: </w:t>
+        <w:t xml:space="preserve">Hair style (dropdown): </w:t>
       </w:r>
       <w:r>
-        <w:t>Practical low bun, a few loose strands at the temples (work-day realism)</w:t>
+        <w:t>long layers</w:t>
+      </w:r>
+    </w:p>
+    <w:p>
+      <w:r>
+        <w:rPr>
+          <w:i/>
+          <w:color w:val="666666"/>
+          <w:sz w:val="18"/>
+        </w:rPr>
+        <w:t>Doesn't matter which preset — see the bug note above. The real hairstyle is in Face details below.</w:t>
+      </w:r>
+    </w:p>
+    <w:p>
+      <w:r>
+        <w:rPr>
+          <w:b/>
+        </w:rPr>
+        <w:t xml:space="preserve">Hair color: </w:t>
+      </w:r>
+      <w:r>
+        <w:t>dark brown</w:t>
       </w:r>
     </w:p>
     <w:p>
@@ -108,7 +176,7 @@
         <w:t xml:space="preserve">Eyes: </w:t>
       </w:r>
       <w:r>
-        <w:t>Dark brown, alert, warm</w:t>
+        <w:t>dark brown, alert, warm</w:t>
       </w:r>
     </w:p>
     <w:p>
@@ -116,10 +184,20 @@
         <w:rPr>
           <w:b/>
         </w:rPr>
-        <w:t xml:space="preserve">Face: </w:t>
+        <w:t xml:space="preserve">Face details: </w:t>
       </w:r>
       <w:r>
-        <w:t>Round-oval, soft features, expressive brows, smile lines</w:t>
+        <w:t>Round-oval face, soft features, expressive brows, smile lines. Hair worn in a practical low bun with a few loose strands at the temples (work-day realism).</w:t>
+      </w:r>
+    </w:p>
+    <w:p>
+      <w:r>
+        <w:rPr>
+          <w:i/>
+          <w:color w:val="666666"/>
+          <w:sz w:val="18"/>
+        </w:rPr>
+        <w:t>This field is carrying the real hairstyle instruction — see bug note above.</w:t>
       </w:r>
     </w:p>
     <w:p>
@@ -127,10 +205,10 @@
         <w:rPr>
           <w:b/>
         </w:rPr>
-        <w:t xml:space="preserve">Wardrobe (locked, every scene): </w:t>
+        <w:t xml:space="preserve">Build: </w:t>
       </w:r>
       <w:r>
-        <w:t>Fitted black polo, black bistro server apron (waist-length) with order pad and pen in pocket, small name tag reading MARIA on the right chest, black slacks, comfortable black work shoes, small stud earrings only</w:t>
+        <w:t>Average height, average build — on-her-feet-all-shift posture</w:t>
       </w:r>
     </w:p>
     <w:p>
@@ -138,26 +216,32 @@
         <w:rPr>
           <w:b/>
         </w:rPr>
-        <w:t xml:space="preserve">Vibe: </w:t>
+        <w:t xml:space="preserve">Signature wardrobe: </w:t>
+      </w:r>
+      <w:r>
+        <w:t>Fitted black polo, black bistro server apron (waist-length) with order pad and pen in the pocket, small name tag reading MARIA on the right chest, black slacks, comfortable black work shoes, small stud earrings only</w:t>
+      </w:r>
+    </w:p>
+    <w:p>
+      <w:r>
+        <w:rPr>
+          <w:b/>
+        </w:rPr>
+        <w:t xml:space="preserve">Vibe / personality: </w:t>
       </w:r>
       <w:r>
         <w:t>Warm, hardworking, quietly determined — confidence visibly grows across episodes</w:t>
       </w:r>
     </w:p>
     <w:p>
-      <w:pPr>
-        <w:pStyle w:val="Heading3"/>
-      </w:pPr>
       <w:r>
-        <w:t>Consolidated description (single paste)</w:t>
+        <w:rPr>
+          <w:b/>
+        </w:rPr>
+        <w:t xml:space="preserve">Reference photo: </w:t>
       </w:r>
-    </w:p>
-    <w:p>
-      <w:pPr>
-        <w:spacing w:after="240"/>
-      </w:pPr>
       <w:r>
-        <w:t>Maria: an adult Latina woman in her late 20s, medium olive skin tone (Monk scale 5) with a warm-neutral undertone, dark brown hair with a 2C-3A wave/curl texture worn in a practical low bun with a few loose strands at the temples, dark brown alert warm eyes, a round-oval face with soft features and smile lines. Wardrobe: fitted black polo, black waist-length bistro server apron with an order pad and pen in the pocket, a small name tag reading MARIA on the right chest, black slacks, black work shoes, small stud earrings only. Vibe: warm, hardworking, quietly determined.</w:t>
+        <w:t>None yet — leave blank. Generate from these fields, then the approved portrait becomes the reference for future uploads.</w:t>
       </w:r>
     </w:p>
     <w:p>
@@ -169,11 +253,11 @@
       </w:r>
     </w:p>
     <w:p>
-      <w:pPr>
-        <w:spacing w:after="240"/>
-      </w:pPr>
       <w:r>
-        <w:t>At Monk 5, the Lab's deep-skin exposure guidance will NOT auto-apply (it only triggers at deeper tones). Watch for the opposite drift: AI models tend to wash olive skin toward generic pale pink. If a portrait comes out lighter or pinker than intended, add this to the prompt and regenerate before approving: "medium olive skin tone, warm-neutral undertone, no pink shift."</w:t>
+        <w:rPr>
+          <w:color w:val="B03A2E"/>
+        </w:rPr>
+        <w:t>At Monk 5, the Lab's deep-skin exposure guidance will NOT auto-apply (it only triggers at deeper tones). Watch for the opposite drift: AI models tend to wash olive skin toward generic pale pink. If a portrait comes out lighter or pinker than intended, add this to the Face details field and regenerate before approving: "medium olive skin tone, olive undertone, no pink shift."</w:t>
       </w:r>
     </w:p>
     <w:p>
@@ -211,7 +295,18 @@
         <w:rPr>
           <w:b/>
         </w:rPr>
-        <w:t xml:space="preserve">Race / ethnicity: </w:t>
+        <w:t xml:space="preserve">Gender / identity: </w:t>
+      </w:r>
+      <w:r>
+        <w:t>man</w:t>
+      </w:r>
+    </w:p>
+    <w:p>
+      <w:r>
+        <w:rPr>
+          <w:b/>
+        </w:rPr>
+        <w:t xml:space="preserve">Ethnicity / ancestry: </w:t>
       </w:r>
       <w:r>
         <w:t>White (US)</w:t>
@@ -222,10 +317,10 @@
         <w:rPr>
           <w:b/>
         </w:rPr>
-        <w:t xml:space="preserve">Skin tone (Monk scale 1-10): </w:t>
+        <w:t xml:space="preserve">Skin tone: </w:t>
       </w:r>
       <w:r>
-        <w:t>3 — light-medium</w:t>
+        <w:t>Click swatch 3 on the Monk Skin Tone row</w:t>
       </w:r>
     </w:p>
     <w:p>
@@ -233,10 +328,10 @@
         <w:rPr>
           <w:b/>
         </w:rPr>
-        <w:t xml:space="preserve">Undertone: </w:t>
+        <w:t xml:space="preserve">Undertone (dropdown): </w:t>
       </w:r>
       <w:r>
-        <w:t>Neutral</w:t>
+        <w:t>neutral</w:t>
       </w:r>
     </w:p>
     <w:p>
@@ -244,10 +339,20 @@
         <w:rPr>
           <w:b/>
         </w:rPr>
-        <w:t xml:space="preserve">Hair texture: </w:t>
+        <w:t xml:space="preserve">Hair texture (dropdown): </w:t>
       </w:r>
       <w:r>
-        <w:t>1B (straight, slight body), dark brown with clear graying at the temples</w:t>
+        <w:t>Straight (1A–1C)</w:t>
+      </w:r>
+    </w:p>
+    <w:p>
+      <w:r>
+        <w:rPr>
+          <w:i/>
+          <w:color w:val="666666"/>
+          <w:sz w:val="18"/>
+        </w:rPr>
+        <w:t>Closest literal match to "straight, slight body."</w:t>
       </w:r>
     </w:p>
     <w:p>
@@ -255,10 +360,31 @@
         <w:rPr>
           <w:b/>
         </w:rPr>
-        <w:t xml:space="preserve">Hair style: </w:t>
+        <w:t xml:space="preserve">Hair style (dropdown): </w:t>
       </w:r>
       <w:r>
-        <w:t>Short, neat, professional. Graying temples are a locked identity feature — do not let generations "youthen" him</w:t>
+        <w:t>long layers</w:t>
+      </w:r>
+    </w:p>
+    <w:p>
+      <w:r>
+        <w:rPr>
+          <w:i/>
+          <w:color w:val="666666"/>
+          <w:sz w:val="18"/>
+        </w:rPr>
+        <w:t>Doesn't matter which preset — see the bug note above. The real hairstyle is in Face details below.</w:t>
+      </w:r>
+    </w:p>
+    <w:p>
+      <w:r>
+        <w:rPr>
+          <w:b/>
+        </w:rPr>
+        <w:t xml:space="preserve">Hair color: </w:t>
+      </w:r>
+      <w:r>
+        <w:t>dark brown with graying at the temples</w:t>
       </w:r>
     </w:p>
     <w:p>
@@ -269,7 +395,7 @@
         <w:t xml:space="preserve">Eyes: </w:t>
       </w:r>
       <w:r>
-        <w:t>Gray-blue, steady, crow's feet when he smiles</w:t>
+        <w:t>gray-blue, steady, crow's feet when he smiles</w:t>
       </w:r>
     </w:p>
     <w:p>
@@ -277,10 +403,20 @@
         <w:rPr>
           <w:b/>
         </w:rPr>
-        <w:t xml:space="preserve">Face: </w:t>
+        <w:t xml:space="preserve">Face details: </w:t>
       </w:r>
       <w:r>
-        <w:t>Rectangular, lightly lined (forehead and smile lines), friendly lived-in face. Clean-shaven or light stubble — pick ONE at turnaround time and lock it</w:t>
+        <w:t>Rectangular, lightly lined face (forehead and smile lines), friendly lived-in look, clean-shaven. Hair short, neat, professional, with graying temples — this is a locked identity feature; do not let generations "youthen" him or remove the gray.</w:t>
+      </w:r>
+    </w:p>
+    <w:p>
+      <w:r>
+        <w:rPr>
+          <w:i/>
+          <w:color w:val="666666"/>
+          <w:sz w:val="18"/>
+        </w:rPr>
+        <w:t>This field is carrying the real hairstyle instruction — see bug note above.</w:t>
       </w:r>
     </w:p>
     <w:p>
@@ -288,10 +424,10 @@
         <w:rPr>
           <w:b/>
         </w:rPr>
-        <w:t xml:space="preserve">Wardrobe (locked, every scene): </w:t>
+        <w:t xml:space="preserve">Build: </w:t>
       </w:r>
       <w:r>
-        <w:t>Dark charcoal button-down shirt with sleeves rolled to the forearm, manager badge on a black lanyard, dark jeans-cut slacks, brown leather belt, wristwatch</w:t>
+        <w:t>Tall (around 6'0"), broad-shouldered, average build</w:t>
       </w:r>
     </w:p>
     <w:p>
@@ -299,26 +435,32 @@
         <w:rPr>
           <w:b/>
         </w:rPr>
-        <w:t xml:space="preserve">Vibe: </w:t>
+        <w:t xml:space="preserve">Signature wardrobe: </w:t>
+      </w:r>
+      <w:r>
+        <w:t>Dark charcoal button-down with sleeves rolled to the forearm, manager badge on a black lanyard, dark jeans-cut slacks, brown leather belt, wristwatch</w:t>
+      </w:r>
+    </w:p>
+    <w:p>
+      <w:r>
+        <w:rPr>
+          <w:b/>
+        </w:rPr>
+        <w:t xml:space="preserve">Vibe / personality: </w:t>
       </w:r>
       <w:r>
         <w:t>Steady, encouraging, dry humor — the calmest person in every room</w:t>
       </w:r>
     </w:p>
     <w:p>
-      <w:pPr>
-        <w:pStyle w:val="Heading3"/>
-      </w:pPr>
       <w:r>
-        <w:t>Consolidated description (single paste)</w:t>
+        <w:rPr>
+          <w:b/>
+        </w:rPr>
+        <w:t xml:space="preserve">Reference photo: </w:t>
       </w:r>
-    </w:p>
-    <w:p>
-      <w:pPr>
-        <w:spacing w:after="240"/>
-      </w:pPr>
       <w:r>
-        <w:t>James: an adult white man in his mid 40s, light-medium skin tone (Monk scale 3) with a neutral undertone, straight dark brown hair (1B texture) with clear graying at the temples, worn short and neat and professional — the graying temples must never be youthened away. Gray-blue steady eyes with crow's feet when he smiles. A rectangular, lightly lined face (forehead and smile lines), friendly and lived-in, clean-shaven. Wardrobe: dark charcoal button-down shirt with sleeves rolled to the forearm, a manager badge on a black lanyard, dark jeans-cut slacks, a brown leather belt, a wristwatch. Vibe: steady, encouraging, dry humor, the calmest person in every room.</w:t>
+        <w:t>None yet — leave blank. Generate from these fields, then the approved portrait becomes the reference for future uploads.</w:t>
       </w:r>
     </w:p>
     <w:p>
@@ -331,23 +473,7 @@
     </w:p>
     <w:p>
       <w:r>
-        <w:t>Use the Lab's standard turnaround-sheet template with each character's consolidated description above substituted in for [CHARACTER DESCRIPTION]:</w:t>
-      </w:r>
-    </w:p>
-    <w:p>
-      <w:pPr>
-        <w:pStyle w:val="Heading3"/>
-      </w:pPr>
-      <w:r>
-        <w:t>Template</w:t>
-      </w:r>
-    </w:p>
-    <w:p>
-      <w:pPr>
-        <w:spacing w:after="240"/>
-      </w:pPr>
-      <w:r>
-        <w:t>Character reference turnaround sheet on a single image: the EXACT same character shown full-body from five angles side by side — front view, three-quarter left view, left profile, back view, three-quarter right view — plus a chest-up front close-up and a side-face close-up. [CHARACTER DESCRIPTION]. Identical face, identical hairstyle, identical outfit and colors in every view. Neutral relaxed standing pose, arms at sides, plain light-grey seamless studio background, soft even professional lighting, photorealistic, highly detailed, no text, no labels, no props.</w:t>
+        <w:t>Once each character is created and its portrait approved, use the Lab's turnaround-sheet generator (it compiles the fields above automatically into the consistency token). No manual prompt entry needed for this step — the Lab does it from the saved character.</w:t>
       </w:r>
     </w:p>
     <w:p>
@@ -360,15 +486,7 @@
     </w:p>
     <w:p>
       <w:r>
-        <w:t>Paste this into any scene prompt that features both characters together:</w:t>
-      </w:r>
-    </w:p>
-    <w:p>
-      <w:pPr>
-        <w:pStyle w:val="Heading3"/>
-      </w:pPr>
-      <w:r>
-        <w:t>Scene string</w:t>
+        <w:t>For scene prompts featuring both characters together (outside the Lab, e.g. in the Image or Video Studio's scene prompt field), paste this:</w:t>
       </w:r>
     </w:p>
     <w:p>
@@ -392,7 +510,7 @@
         <w:pStyle w:val="ListBullet"/>
       </w:pPr>
       <w:r>
-        <w:t>Enter Maria in Character Lab -&gt; generate portrait -&gt; approve -&gt; pin seed</w:t>
+        <w:t>Enter Maria in Character Lab (all fields above) -&gt; Create character</w:t>
       </w:r>
     </w:p>
     <w:p>
@@ -400,7 +518,15 @@
         <w:pStyle w:val="ListBullet"/>
       </w:pPr>
       <w:r>
-        <w:t>Enter James in Character Lab -&gt; generate portrait -&gt; approve -&gt; pin seed</w:t>
+        <w:t>Enter James in Character Lab (all fields above) -&gt; Create character</w:t>
+      </w:r>
+    </w:p>
+    <w:p>
+      <w:pPr>
+        <w:pStyle w:val="ListBullet"/>
+      </w:pPr>
+      <w:r>
+        <w:t>Generate + approve each portrait; regenerate with the pink-shift fix if Maria's tone drifts</w:t>
       </w:r>
     </w:p>
     <w:p>
@@ -409,6 +535,14 @@
       </w:pPr>
       <w:r>
         <w:t>Generate both turnaround sheets -&gt; approve -&gt; store</w:t>
+      </w:r>
+    </w:p>
+    <w:p>
+      <w:pPr>
+        <w:pStyle w:val="ListBullet"/>
+      </w:pPr>
+      <w:r>
+        <w:t>Pin each character's seed once approved</w:t>
       </w:r>
     </w:p>
     <w:p>

</xml_diff>

<commit_message>
Fix hair-style dropdown conflict found live in Maria's first character card
Confirmed bug: 'long layers' + the Face-details bun instruction land in the
same compiled sentence and visibly contradict each other ('hair styled as
long layers... Hair worn in a practical low bun...'). Switched Maria's pick
to 'protective updo' (agrees with 'up' instead of fighting it). Flagged the
same risk for James's pick, with a fallback option. Recorded Maria's
auto-assigned seed (482784) and confirmed the real create -> Master portrait
-> full sheet workflow order from the live app.

Co-Authored-By: Claude Fable 5 <noreply@anthropic.com>
Claude-Session: https://claude.ai/code/session_01BbznzE6vYuuAPK9F9HY6r3
</commit_message>
<xml_diff>
--- a/restaurant-track/characters/RAMP_CharacterSheet_MariaJames.docx
+++ b/restaurant-track/characters/RAMP_CharacterSheet_MariaJames.docx
@@ -144,7 +144,7 @@
         <w:t xml:space="preserve">Hair style (dropdown): </w:t>
       </w:r>
       <w:r>
-        <w:t>long layers</w:t>
+        <w:t>protective updo</w:t>
       </w:r>
     </w:p>
     <w:p>
@@ -154,7 +154,7 @@
           <w:color w:val="666666"/>
           <w:sz w:val="18"/>
         </w:rPr>
-        <w:t>Doesn't matter which preset — see the bug note above. The real hairstyle is in Face details below.</w:t>
+        <w:t>CORRECTED from an earlier "long layers" pick: confirmed live in Maria's first compiled token that "long layers" produces a literal contradiction against the Face details bun instruction (the compiler stitches both into one sentence, so they visibly fight). "Protective updo" is the only preset whose literal meaning (hair pulled up) agrees with "low bun" instead of fighting it.</w:t>
       </w:r>
     </w:p>
     <w:p>
@@ -373,7 +373,7 @@
           <w:color w:val="666666"/>
           <w:sz w:val="18"/>
         </w:rPr>
-        <w:t>Doesn't matter which preset — see the bug note above. The real hairstyle is in Face details below.</w:t>
+        <w:t>Try this first; if the length reads wrong against "short, neat, professional" in Face details, switch to "short natural afro" instead — see Maria's confirmed contradiction bug above. No preset actually fits a short professional cut; check his Master portrait carefully before locking.</w:t>
       </w:r>
     </w:p>
     <w:p>
@@ -468,12 +468,12 @@
         <w:pStyle w:val="Heading2"/>
       </w:pPr>
       <w:r>
-        <w:t>Turnaround Sheet Prompt (both characters)</w:t>
+        <w:t>Confirmed Workflow Order (from the live app)</w:t>
       </w:r>
     </w:p>
     <w:p>
       <w:r>
-        <w:t>Once each character is created and its portrait approved, use the Lab's turnaround-sheet generator (it compiles the fields above automatically into the consistency token). No manual prompt entry needed for this step — the Lab does it from the saved character.</w:t>
+        <w:t>1) Create character. 2) Hit "Master portrait" first — one image, cheap to redo. Check the skin tone (watch for pink drift on Maria) and confirm the hairstyle reads correctly before spending on the full sheet. 3) Only once that looks right, hit "Generate character sheet (all angles)" — that's the real multi-angle turnaround reference everything else anchors to. 4) Approve and store. Skip "Create a language/culture variant" for now — that's the Spanish/French track for Month 3+.</w:t>
       </w:r>
     </w:p>
     <w:p>

</xml_diff>